<commit_message>
Fix meeting leave Word export fields
Updated the meeting leave export to include the event end date and meeting time/month metadata when filling the DOCX template. This ensures generated leave documents reflect the correct event schedule and the updated meeting-leave template is used consistently.
</commit_message>
<xml_diff>
--- a/backend/templates/leave_template_meeting.docx
+++ b/backend/templates/leave_template_meeting.docx
@@ -374,28 +374,35 @@
           <w:rFonts w:ascii="TH SarabunIT๙" w:hAnsi="TH SarabunIT๙" w:cs="TH SarabunIT๙"/>
           <w:sz w:val="34"/>
           <w:szCs w:val="34"/>
-          <w:cs/>
-        </w:rPr>
-        <w:t>กันยายน</w:t>
-      </w:r>
-      <w:r>
-        <w:rPr>
-          <w:rFonts w:ascii="TH SarabunIT๙" w:hAnsi="TH SarabunIT๙" w:cs="TH SarabunIT๙"/>
-          <w:sz w:val="34"/>
-          <w:szCs w:val="34"/>
-          <w:cs/>
-        </w:rPr>
-        <w:t xml:space="preserve"> ๒๕๖๙</w:t>
-      </w:r>
-      <w:r>
-        <w:rPr>
-          <w:rFonts w:ascii="TH SarabunIT๙" w:hAnsi="TH SarabunIT๙" w:cs="TH SarabunIT๙"/>
-          <w:sz w:val="34"/>
-          <w:szCs w:val="34"/>
-          <w:cs/>
-        </w:rPr>
-        <w:tab/>
-        <w:t xml:space="preserve">           </w:t>
+        </w:rPr>
+        <w:t>{</w:t>
+      </w:r>
+      <w:proofErr w:type="spellStart"/>
+      <w:r>
+        <w:rPr>
+          <w:rFonts w:ascii="TH SarabunIT๙" w:hAnsi="TH SarabunIT๙" w:cs="TH SarabunIT๙"/>
+          <w:sz w:val="34"/>
+          <w:szCs w:val="34"/>
+        </w:rPr>
+        <w:t>event_month_year</w:t>
+      </w:r>
+      <w:proofErr w:type="spellEnd"/>
+      <w:r>
+        <w:rPr>
+          <w:rFonts w:ascii="TH SarabunIT๙" w:hAnsi="TH SarabunIT๙" w:cs="TH SarabunIT๙"/>
+          <w:sz w:val="34"/>
+          <w:szCs w:val="34"/>
+        </w:rPr>
+        <w:t>}</w:t>
+      </w:r>
+      <w:r>
+        <w:rPr>
+          <w:rFonts w:ascii="TH SarabunIT๙" w:hAnsi="TH SarabunIT๙" w:cs="TH SarabunIT๙"/>
+          <w:sz w:val="34"/>
+          <w:szCs w:val="34"/>
+          <w:cs/>
+        </w:rPr>
+        <w:t xml:space="preserve">          </w:t>
       </w:r>
       <w:r>
         <w:rPr>
@@ -649,18 +656,26 @@
           <w:rFonts w:ascii="TH SarabunIT๙" w:hAnsi="TH SarabunIT๙" w:cs="TH SarabunIT๙"/>
           <w:sz w:val="34"/>
           <w:szCs w:val="34"/>
-          <w:cs/>
-        </w:rPr>
-        <w:t>กันยายน</w:t>
-      </w:r>
-      <w:r>
-        <w:rPr>
-          <w:rFonts w:ascii="TH SarabunIT๙" w:hAnsi="TH SarabunIT๙" w:cs="TH SarabunIT๙"/>
-          <w:sz w:val="34"/>
-          <w:szCs w:val="34"/>
-          <w:cs/>
-        </w:rPr>
-        <w:t xml:space="preserve"> ๒๕๖๙</w:t>
+        </w:rPr>
+        <w:t>{</w:t>
+      </w:r>
+      <w:proofErr w:type="spellStart"/>
+      <w:r>
+        <w:rPr>
+          <w:rFonts w:ascii="TH SarabunIT๙" w:hAnsi="TH SarabunIT๙" w:cs="TH SarabunIT๙"/>
+          <w:sz w:val="34"/>
+          <w:szCs w:val="34"/>
+        </w:rPr>
+        <w:t>event_month_year</w:t>
+      </w:r>
+      <w:proofErr w:type="spellEnd"/>
+      <w:r>
+        <w:rPr>
+          <w:rFonts w:ascii="TH SarabunIT๙" w:hAnsi="TH SarabunIT๙" w:cs="TH SarabunIT๙"/>
+          <w:sz w:val="34"/>
+          <w:szCs w:val="34"/>
+        </w:rPr>
+        <w:t>}</w:t>
       </w:r>
       <w:r>
         <w:rPr>
@@ -740,25 +755,42 @@
           <w:szCs w:val="34"/>
           <w:cs/>
         </w:rPr>
-        <w:t xml:space="preserve"> ๑๐</w:t>
-      </w:r>
-      <w:r>
-        <w:rPr>
-          <w:rFonts w:ascii="TH SarabunIT๙" w:hAnsi="TH SarabunIT๙" w:cs="TH SarabunIT๙"/>
-          <w:sz w:val="34"/>
-          <w:szCs w:val="34"/>
-          <w:cs/>
-        </w:rPr>
-        <w:t>.๐</w:t>
-      </w:r>
-      <w:r>
-        <w:rPr>
-          <w:rFonts w:ascii="TH SarabunIT๙" w:hAnsi="TH SarabunIT๙" w:cs="TH SarabunIT๙"/>
-          <w:sz w:val="34"/>
-          <w:szCs w:val="34"/>
-          <w:cs/>
-        </w:rPr>
-        <w:t xml:space="preserve">๐ </w:t>
+        <w:t xml:space="preserve"> </w:t>
+      </w:r>
+      <w:r>
+        <w:rPr>
+          <w:rFonts w:ascii="TH SarabunIT๙" w:hAnsi="TH SarabunIT๙" w:cs="TH SarabunIT๙"/>
+          <w:sz w:val="34"/>
+          <w:szCs w:val="34"/>
+        </w:rPr>
+        <w:t>{</w:t>
+      </w:r>
+      <w:proofErr w:type="spellStart"/>
+      <w:r>
+        <w:rPr>
+          <w:rFonts w:ascii="TH SarabunIT๙" w:hAnsi="TH SarabunIT๙" w:cs="TH SarabunIT๙"/>
+          <w:sz w:val="34"/>
+          <w:szCs w:val="34"/>
+        </w:rPr>
+        <w:t>start_time</w:t>
+      </w:r>
+      <w:proofErr w:type="spellEnd"/>
+      <w:r>
+        <w:rPr>
+          <w:rFonts w:ascii="TH SarabunIT๙" w:hAnsi="TH SarabunIT๙" w:cs="TH SarabunIT๙"/>
+          <w:sz w:val="34"/>
+          <w:szCs w:val="34"/>
+        </w:rPr>
+        <w:t>}</w:t>
+      </w:r>
+      <w:r>
+        <w:rPr>
+          <w:rFonts w:ascii="TH SarabunIT๙" w:hAnsi="TH SarabunIT๙" w:cs="TH SarabunIT๙"/>
+          <w:sz w:val="34"/>
+          <w:szCs w:val="34"/>
+          <w:cs/>
+        </w:rPr>
+        <w:t xml:space="preserve"> </w:t>
       </w:r>
       <w:r>
         <w:rPr>
@@ -783,9 +815,8 @@
           <w:rFonts w:ascii="TH SarabunIT๙" w:hAnsi="TH SarabunIT๙" w:cs="TH SarabunIT๙"/>
           <w:sz w:val="34"/>
           <w:szCs w:val="34"/>
-          <w:cs/>
-        </w:rPr>
-        <w:t>ห้องประชุม ชั้น ๓ ศาลเยาวชนและครอบครัวจังหวัดประจวบคีรีขันธ์</w:t>
+        </w:rPr>
+        <w:t>{location}</w:t>
       </w:r>
     </w:p>
     <w:p>

</xml_diff>